<commit_message>
docs: shorten the README walkthrough dialogue
Part D cut from 1592 to 858 spoken words -- 10m36s down to 5m43s, a 46%
reduction -- while keeping all thirteen blocks and every argument.

Plain spoken English throughout, shorter sentences. "It's a shared message
board" rather than "a shared event bus that everything publishes to and
subscribes from"; "an agent that spawns agents will run away from you" rather
than the longer budget explanation. The substance is unchanged: D6 still walks
the diagram box by box, D12 still carries the numbers, the wiring gap, the two
deliberately stopped features and the rough edges.

Per-block: D1 88->42, D2 112->62, D3 55->29, D4 101->63, D5 77->34,
D6 288->151, D7 118->45, D8 106->61, D9 107->59, D10 120->77, D11 83->43,
D12 253->145, D13 84->47.

Corrected the stated timings, which were a guess and wrong twice. Now measured
per block: FULL 11m40s, RECOMMENDED (D1/D4/D6/D12/D13) 8m55s, TIGHT
(D4/D6/D12) 8m20s.
</commit_message>
<xml_diff>
--- a/RAZORPAY_DEMO_SCRIPT.docx
+++ b/RAZORPAY_DEMO_SCRIPT.docx
@@ -3125,7 +3125,7 @@
           <w:sz w:val="20"/>
           <w:szCs w:val="20"/>
         </w:rPr>
-        <w:t xml:space="preserve">This is the closing third of the video and the part a live demo cannot make. Everything below is verbatim. Each block gives you the scroll position and the words. Sections marked CORE are the spine — keep those. Sections marked OPTIONAL can go if you need to shorten.</w:t>
+        <w:t xml:space="preserve">This is the closing third of the video. Everything below is verbatim — plain spoken English, short sentences. Each block gives you the scroll position and the words. CORE blocks are the spine; OPTIONAL ones can go if you need to shorten.</w:t>
       </w:r>
     </w:p>
     <w:p>
@@ -3134,23 +3134,11 @@
       </w:pPr>
       <w:r>
         <w:rPr>
-          <w:sz w:val="20"/>
-          <w:szCs w:val="20"/>
-        </w:rPr>
-        <w:t xml:space="preserve">Pace yourself. Let each part of the diagram sit on screen for a beat before you talk over it.</w:t>
-      </w:r>
-    </w:p>
-    <w:p>
-      <w:pPr>
-        <w:spacing w:before="0" w:after="80"/>
-      </w:pPr>
-      <w:r>
-        <w:rPr>
-          <w:b/>
-          <w:sz w:val="20"/>
-          <w:szCs w:val="20"/>
-        </w:rPr>
-        <w:t xml:space="preserve">Measured timings at a normal speaking pace (150 words per minute):</w:t>
+          <w:b/>
+          <w:sz w:val="20"/>
+          <w:szCs w:val="20"/>
+        </w:rPr>
+        <w:t xml:space="preserve">Measured at a normal speaking pace (150 words per minute):</w:t>
       </w:r>
     </w:p>
     <w:p>
@@ -3163,7 +3151,7 @@
           <w:sz w:val="20"/>
           <w:szCs w:val="20"/>
         </w:rPr>
-        <w:t xml:space="preserve">•  D1 banner 35s  ·  D2 lineage 45s  ·  D3 versions 22s  ·  D4 ten phases 40s  ·  D5 pillars 31s</w:t>
+        <w:t xml:space="preserve">•  D1 17s · D2 25s · D3 12s · D4 25s · D5 14s · D6 60s · D7 18s</w:t>
       </w:r>
     </w:p>
     <w:p>
@@ -3176,7 +3164,7 @@
           <w:sz w:val="20"/>
           <w:szCs w:val="20"/>
         </w:rPr>
-        <w:t xml:space="preserve">•  D6 architecture 1m55s  ·  D7 memory 47s  ·  D8 goals+agents 42s  ·  D9 forge 43s</w:t>
+        <w:t xml:space="preserve">•  D8 24s · D9 24s · D10 31s · D11 17s · D12 58s · D13 19s</w:t>
       </w:r>
     </w:p>
     <w:p>
@@ -3186,24 +3174,24 @@
       </w:pPr>
       <w:r>
         <w:rPr>
-          <w:sz w:val="20"/>
-          <w:szCs w:val="20"/>
-        </w:rPr>
-        <w:t xml:space="preserve">•  D10 hardware 48s  ·  D11 risks 33s  ·  D12 honest status 1m41s  ·  D13 day-in-life 34s</w:t>
-      </w:r>
-    </w:p>
-    <w:p>
-      <w:pPr>
-        <w:ind w:left="200"/>
-        <w:spacing w:before="0" w:after="50"/>
-      </w:pPr>
-      <w:r>
-        <w:rPr>
-          <w:b/>
-          <w:sz w:val="20"/>
-          <w:szCs w:val="20"/>
-        </w:rPr>
-        <w:t xml:space="preserve">•  Part D in full: 10m36s.  Part B (the live demo) is a further 5m10s.</w:t>
+          <w:b/>
+          <w:sz w:val="20"/>
+          <w:szCs w:val="20"/>
+        </w:rPr>
+        <w:t xml:space="preserve">•  Part D in full: 5m 43s.  Part B (the live demo) is a further 5m 10s.</w:t>
+      </w:r>
+    </w:p>
+    <w:p>
+      <w:pPr>
+        <w:spacing w:before="0" w:after="80"/>
+      </w:pPr>
+      <w:r>
+        <w:rPr>
+          <w:i/>
+          <w:sz w:val="20"/>
+          <w:szCs w:val="20"/>
+        </w:rPr>
+        <w:t xml:space="preserve">Let each part of the diagram sit on screen for a beat before you talk over it. Short sentences sound confident; do not pad them back out.</w:t>
       </w:r>
     </w:p>
     <w:p>
@@ -3233,7 +3221,7 @@
           <w:sz w:val="18"/>
           <w:szCs w:val="18"/>
         </w:rPr>
-        <w:t xml:space="preserve">SCROLL TO:  the very top: the ARISE ASCII banner and the badge row</w:t>
+        <w:t xml:space="preserve">SCROLL TO:  the top: ARISE banner and badges</w:t>
       </w:r>
     </w:p>
     <w:p>
@@ -3247,7 +3235,7 @@
           <w:sz w:val="20"/>
           <w:szCs w:val="20"/>
         </w:rPr>
-        <w:t xml:space="preserve">So this is the repository. The project has two halves. ARIA is the voice agent you just watched — that part is finished and it runs. ARISE is what I've been building on top of it for the last few months, and it's a different category of thing.</w:t>
+        <w:t xml:space="preserve">This is the repo. Two halves. ARIA is the voice agent you just watched — that part works. ARISE is what I built on top of it.</w:t>
       </w:r>
       <w:r>
         <w:br/>
@@ -3267,7 +3255,7 @@
           <w:sz w:val="20"/>
           <w:szCs w:val="20"/>
         </w:rPr>
-        <w:t xml:space="preserve">The tagline is deliberately ambitious, and I'll be honest with you about how much of it is running today versus built and waiting to be connected. Let me show you the design first, then I'll tell you exactly where it stands.</w:t>
+        <w:t xml:space="preserve">The tagline is ambitious. I'll show you the design, then tell you honestly what runs today.</w:t>
       </w:r>
     </w:p>
     <w:p>
@@ -3282,7 +3270,7 @@
           <w:sz w:val="16"/>
           <w:szCs w:val="16"/>
         </w:rPr>
-        <w:t xml:space="preserve">Note: Setting up the honesty beat this early is what buys you credibility for everything after it. Do not skip these two sentences.</w:t>
+        <w:t xml:space="preserve">Note: Setting up the honesty beat this early buys credibility for everything after. Don't skip it.</w:t>
       </w:r>
     </w:p>
     <w:p>
@@ -3326,7 +3314,7 @@
           <w:sz w:val="20"/>
           <w:szCs w:val="20"/>
         </w:rPr>
-        <w:t xml:space="preserve">This is the clearest way to see what changed. On the left is ARIA: it's reactive. I speak, a tool fires, it replies, and when the process dies it forgets almost everything.</w:t>
+        <w:t xml:space="preserve">Left is ARIA. I speak, a tool fires, it replies, and it forgets when it shuts down.</w:t>
       </w:r>
       <w:r>
         <w:br/>
@@ -3346,7 +3334,7 @@
           <w:sz w:val="20"/>
           <w:szCs w:val="20"/>
         </w:rPr>
-        <w:t xml:space="preserve">On the right is what ARISE is built to be. Instead of one inference loop, several specialised minds. Instead of a flat conversation log, a memory system with real structure. Instead of a toolset fixed at compile time, one that can write its own tools. And instead of only looking when I ask it to, continuous perception.</w:t>
+        <w:t xml:space="preserve">Right is ARISE. Several specialised minds instead of one loop. Structured memory instead of a flat log. Tools it writes itself. And it watches, instead of waiting to be asked.</w:t>
       </w:r>
       <w:r>
         <w:br/>
@@ -3366,7 +3354,7 @@
           <w:sz w:val="20"/>
           <w:szCs w:val="20"/>
         </w:rPr>
-        <w:t xml:space="preserve">That right-hand column is the design target. Most of it is written; the last step is wiring it together, and I'll come back to that.</w:t>
+        <w:t xml:space="preserve">That right column is the target. Most of it is written; the last step is connecting it.</w:t>
       </w:r>
     </w:p>
     <w:p>
@@ -3410,7 +3398,7 @@
           <w:sz w:val="20"/>
           <w:szCs w:val="20"/>
         </w:rPr>
-        <w:t xml:space="preserve">Each of these branches was a real version, not a feature patch. ARIA v2 was tool execution and basic memory. v2.5 added vector memory and semantic recall, so it could actually search its own history. v2.7 added the planner and neural text-to-speech. ARISE 3.0 is where it stopped being an assistant and became a system.</w:t>
+        <w:t xml:space="preserve">Each branch was a real version. v2 was tools and basic memory. v2.5 added vector search. v2.7 added the planner. ARISE 3.0 is where it stopped being an assistant.</w:t>
       </w:r>
     </w:p>
     <w:p>
@@ -3440,7 +3428,7 @@
           <w:sz w:val="18"/>
           <w:szCs w:val="18"/>
         </w:rPr>
-        <w:t xml:space="preserve">SCROLL TO:  the RELEASE SURFACE box with the ten phases</w:t>
+        <w:t xml:space="preserve">SCROLL TO:  the RELEASE SURFACE box</w:t>
       </w:r>
     </w:p>
     <w:p>
@@ -3454,7 +3442,7 @@
           <w:sz w:val="20"/>
           <w:szCs w:val="20"/>
         </w:rPr>
-        <w:t xml:space="preserve">Ten subsystems. Memory, perception, goals, an orchestrator with sub-agents, a tool forge, a proactive engine, federation across devices, voice and persona, a self-improvement loop, and a privacy vault.</w:t>
+        <w:t xml:space="preserve">Ten subsystems. Memory, perception, goals, an orchestrator with sub-agents, a tool forge, federation, self-improvement, and a privacy vault.</w:t>
       </w:r>
       <w:r>
         <w:br/>
@@ -3474,7 +3462,7 @@
           <w:sz w:val="20"/>
           <w:szCs w:val="20"/>
         </w:rPr>
-        <w:t xml:space="preserve">I want to be precise about this box, because it's the thing you'd most reasonably be sceptical of. Every one of these has real code behind it — I'll show you the numbers in a second. What varies is how far each one got. Some run today. Some are built and tested but not yet connected to the others. Two of them I deliberately stopped working on, and I'll tell you which and why.</w:t>
+        <w:t xml:space="preserve">Let me be straight, because this is the part you'd doubt. Every one has real code behind it — I'll show numbers shortly. What differs is how far each got. Some run today. Some are built and tested but not connected. Two I stopped on purpose.</w:t>
       </w:r>
     </w:p>
     <w:p>
@@ -3489,7 +3477,7 @@
           <w:sz w:val="16"/>
           <w:szCs w:val="16"/>
         </w:rPr>
-        <w:t xml:space="preserve">Note: This is the single most important honesty beat in the whole video. Say it exactly. It pre-empts the one objection that would otherwise sink every other claim.</w:t>
+        <w:t xml:space="preserve">Note: The most important honesty beat in the video. It pre-empts the one objection that would otherwise undermine every other claim.</w:t>
       </w:r>
     </w:p>
     <w:p>
@@ -3533,27 +3521,7 @@
           <w:sz w:val="20"/>
           <w:szCs w:val="20"/>
         </w:rPr>
-        <w:t xml:space="preserve">I kept coming back to these five when deciding what to build. Persistent self — does it remember who I am across reboots. Continuous perception — does it see without being asked. Long-horizon agency — can it hold a goal for days, not one conversation. Self-extension — can it grow its own capabilities. And multi-mind orchestration — can it delegate instead of doing everything in one loop.</w:t>
-      </w:r>
-      <w:r>
-        <w:br/>
-      </w:r>
-      <w:r>
-        <w:rPr>
-          <w:sz w:val="20"/>
-          <w:szCs w:val="20"/>
-        </w:rPr>
-        <w:t xml:space="preserve"/>
-      </w:r>
-      <w:r>
-        <w:br/>
-      </w:r>
-      <w:r>
-        <w:rPr>
-          <w:sz w:val="20"/>
-          <w:szCs w:val="20"/>
-        </w:rPr>
-        <w:t xml:space="preserve">Anything that didn't serve one of those five, I didn't build.</w:t>
+        <w:t xml:space="preserve">These five decided what I built. Does it remember me across reboots. Does it see without being asked. Can it hold a goal for days. Can it add its own tools. Can it delegate.</w:t>
       </w:r>
     </w:p>
     <w:p>
@@ -3583,7 +3551,7 @@
           <w:sz w:val="18"/>
           <w:szCs w:val="18"/>
         </w:rPr>
-        <w:t xml:space="preserve">SCROLL TO:  the big System Architecture box. Give it a moment on screen before you speak.</w:t>
+        <w:t xml:space="preserve">SCROLL TO:  the big System Architecture box. Give it a beat before you speak.</w:t>
       </w:r>
     </w:p>
     <w:p>
@@ -3597,7 +3565,7 @@
           <w:sz w:val="20"/>
           <w:szCs w:val="20"/>
         </w:rPr>
-        <w:t xml:space="preserve">This is the whole system on one page. Let me walk it top to bottom.</w:t>
+        <w:t xml:space="preserve">The whole system on one page. Let me walk it.</w:t>
       </w:r>
       <w:r>
         <w:br/>
@@ -3617,7 +3585,7 @@
           <w:sz w:val="20"/>
           <w:szCs w:val="20"/>
         </w:rPr>
-        <w:t xml:space="preserve">Start in the middle — the blackboard. That's a shared event bus. Everything in the system publishes to it and subscribes from it, rather than calling each other directly. That one decision is what lets me add a new sub-agent without touching any existing one.</w:t>
+        <w:t xml:space="preserve">Middle is the blackboard — a shared message board. Everything posts to it and reads from it. Nothing calls anything else directly, so I can add an agent without touching the old ones.</w:t>
       </w:r>
       <w:r>
         <w:br/>
@@ -3637,7 +3605,7 @@
           <w:sz w:val="20"/>
           <w:szCs w:val="20"/>
         </w:rPr>
-        <w:t xml:space="preserve">On the left, perception writes into it: screen captures, audio classification, and system state — which app is focused, battery, volume, sampled every few seconds. It only posts changes, not a constant stream, so the bus doesn't drown.</w:t>
+        <w:t xml:space="preserve">Left, perception posts what it sees: screen, sound, system state. Only changes, so it doesn't flood.</w:t>
       </w:r>
       <w:r>
         <w:br/>
@@ -3657,7 +3625,7 @@
           <w:sz w:val="20"/>
           <w:szCs w:val="20"/>
         </w:rPr>
-        <w:t xml:space="preserve">On the right, the goal stack. Goals aren't tasks in a to-do list — they have a lifecycle, deadlines, and dependencies, and they survive reboots because they're in SQLite. A goal coming due publishes an event, same as anything else.</w:t>
+        <w:t xml:space="preserve">Right, the goal stack. Goals have deadlines and live in SQLite, so they survive a reboot.</w:t>
       </w:r>
       <w:r>
         <w:br/>
@@ -3677,7 +3645,7 @@
           <w:sz w:val="20"/>
           <w:szCs w:val="20"/>
         </w:rPr>
-        <w:t xml:space="preserve">Underneath both is the cognitive orchestrator. It reads the bus and decides what deserves attention and who should handle it.</w:t>
+        <w:t xml:space="preserve">Underneath, the orchestrator reads the board and decides who handles what.</w:t>
       </w:r>
       <w:r>
         <w:br/>
@@ -3697,7 +3665,7 @@
           <w:sz w:val="20"/>
           <w:szCs w:val="20"/>
         </w:rPr>
-        <w:t xml:space="preserve">And then the row of minds. The primary mind is the 8-billion-parameter model on the GPU — that's the one that talks to me. Around it, smaller specialists on the CPU: a watcher that just monitors for triggers, a curator that reads finished conversations and extracts durable facts, a researcher for multi-step lookups, a coder for edits, and a critic that reviews any output before it gets applied.</w:t>
+        <w:t xml:space="preserve">Then the minds. The big model on the GPU talks to me. Around it, small ones on the CPU — a watcher, a curator that pulls facts out of conversations, a researcher, a coder, and a critic that checks work before it's applied.</w:t>
       </w:r>
       <w:r>
         <w:br/>
@@ -3717,27 +3685,7 @@
           <w:sz w:val="20"/>
           <w:szCs w:val="20"/>
         </w:rPr>
-        <w:t xml:space="preserve">The reason they're small is the hardware. I have six gigabytes of VRAM. The main model already fills it. So everything that needs to run continuously runs on the CPU, and the GPU stays reserved for the one model that has to answer fast. That constraint shaped almost every decision on this page.</w:t>
-      </w:r>
-      <w:r>
-        <w:br/>
-      </w:r>
-      <w:r>
-        <w:rPr>
-          <w:sz w:val="20"/>
-          <w:szCs w:val="20"/>
-        </w:rPr>
-        <w:t xml:space="preserve"/>
-      </w:r>
-      <w:r>
-        <w:br/>
-      </w:r>
-      <w:r>
-        <w:rPr>
-          <w:sz w:val="20"/>
-          <w:szCs w:val="20"/>
-        </w:rPr>
-        <w:t xml:space="preserve">Below that, the memory cortex, and below that the tool forge — I'll take those separately.</w:t>
+        <w:t xml:space="preserve">They're small because of hardware. Six gigs of VRAM, and the main model fills it. So anything running constantly runs on CPU. That limit shaped this whole page.</w:t>
       </w:r>
     </w:p>
     <w:p>
@@ -3752,7 +3700,7 @@
           <w:sz w:val="16"/>
           <w:szCs w:val="16"/>
         </w:rPr>
-        <w:t xml:space="preserve">Note: This is the longest single block in the video, ~80 seconds. Do not rush it. Move the cursor along each box as you name it. If a reviewer only remembers one thing, it should be this.</w:t>
+        <w:t xml:space="preserve">Note: ~58s, the longest block. Don't rush it. Move the cursor along each box as you name it.</w:t>
       </w:r>
     </w:p>
     <w:p>
@@ -3782,7 +3730,7 @@
           <w:sz w:val="18"/>
           <w:szCs w:val="18"/>
         </w:rPr>
-        <w:t xml:space="preserve">SCROLL TO:  the Phase 1 section with the ~/.arise/memory/ file tree</w:t>
+        <w:t xml:space="preserve">SCROLL TO:  the Phase 1 section with the memory file tree</w:t>
       </w:r>
     </w:p>
     <w:p>
@@ -3796,7 +3744,7 @@
           <w:sz w:val="20"/>
           <w:szCs w:val="20"/>
         </w:rPr>
-        <w:t xml:space="preserve">Memory is five separate stores, not one log, because a single table can't model a person.</w:t>
+        <w:t xml:space="preserve">Memory is five stores, not one log. Moments, facts, how I usually do things, identity, and preferences. Identity lives in a git repo, so every change to its behaviour is a commit.</w:t>
       </w:r>
       <w:r>
         <w:br/>
@@ -3816,27 +3764,7 @@
           <w:sz w:val="20"/>
           <w:szCs w:val="20"/>
         </w:rPr>
-        <w:t xml:space="preserve">Episodic is moments — what happened, when, and how important it was. Semantic is extracted facts. Procedural is how I usually do a given thing. Identity is who it is — name, persona, and a do and don't list, and that one's kept in a git repo so every change to its behaviour is a commit I can read back. And preferences are the stable things it's learned about how I like to work.</w:t>
-      </w:r>
-      <w:r>
-        <w:br/>
-      </w:r>
-      <w:r>
-        <w:rPr>
-          <w:sz w:val="20"/>
-          <w:szCs w:val="20"/>
-        </w:rPr>
-        <w:t xml:space="preserve"/>
-      </w:r>
-      <w:r>
-        <w:br/>
-      </w:r>
-      <w:r>
-        <w:rPr>
-          <w:sz w:val="20"/>
-          <w:szCs w:val="20"/>
-        </w:rPr>
-        <w:t xml:space="preserve">Forgetting is deliberate. Everything gets a salience score, and low-salience memories expire after a week while important ones stay. Without that, a system like this just fills up with noise.</w:t>
+        <w:t xml:space="preserve">Forgetting is deliberate. Everything gets a score, and unimportant memories expire after a week.</w:t>
       </w:r>
     </w:p>
     <w:p>
@@ -3866,7 +3794,7 @@
           <w:sz w:val="18"/>
           <w:szCs w:val="18"/>
         </w:rPr>
-        <w:t xml:space="preserve">SCROLL TO:  the Phase 3 goal lifecycle block, then Phase 4</w:t>
+        <w:t xml:space="preserve">SCROLL TO:  the Phase 3 lifecycle block, then Phase 4</w:t>
       </w:r>
     </w:p>
     <w:p>
@@ -3880,7 +3808,7 @@
           <w:sz w:val="20"/>
           <w:szCs w:val="20"/>
         </w:rPr>
-        <w:t xml:space="preserve">The goal lifecycle is a real state machine — proposed, accepted, in progress, blocked, done — and goals can spawn sub-goals. On boot, anything still in progress gets picked back up.</w:t>
+        <w:t xml:space="preserve">Goals are a real state machine — proposed, accepted, in progress, done. Anything unfinished gets picked back up on boot.</w:t>
       </w:r>
       <w:r>
         <w:br/>
@@ -3900,7 +3828,7 @@
           <w:sz w:val="20"/>
           <w:szCs w:val="20"/>
         </w:rPr>
-        <w:t xml:space="preserve">And this is how delegation works. The primary mind doesn't do everything itself; it spawns a sub-agent with a role and a task. Each one gets a hard budget — token limit, time limit, tool-call limit — and gets killed if it exceeds them. That's not a nice-to-have. An agent that can spawn agents will absolutely run away from you, and the budget is what stops it turning into an infinite loop that eats the machine.</w:t>
+        <w:t xml:space="preserve">And this is how it delegates. The main mind spawns a sub-agent with a task and a hard budget — tokens, time, tool calls — and kills it if it goes over. An agent that spawns agents will run away from you.</w:t>
       </w:r>
     </w:p>
     <w:p>
@@ -3930,7 +3858,7 @@
           <w:sz w:val="18"/>
           <w:szCs w:val="18"/>
         </w:rPr>
-        <w:t xml:space="preserve">SCROLL TO:  the Phase 5 forge flow and the ~/.arise/tools/ tree</w:t>
+        <w:t xml:space="preserve">SCROLL TO:  the Phase 5 forge flow and tools tree</w:t>
       </w:r>
     </w:p>
     <w:p>
@@ -3944,7 +3872,7 @@
           <w:sz w:val="20"/>
           <w:szCs w:val="20"/>
         </w:rPr>
-        <w:t xml:space="preserve">This is the part I find most interesting. When the primary mind hits something no existing tool covers, it can write one. The coder drafts a script, the critic reviews it for anything dangerous, it runs in a bubblewrap sandbox against sample inputs, and only if that looks sane does it ask me whether to keep it.</w:t>
+        <w:t xml:space="preserve">My favourite part. When nothing fits, it writes a tool. The coder drafts it, the critic checks it, it runs in a sandbox, and only then does it ask me whether to keep it.</w:t>
       </w:r>
       <w:r>
         <w:br/>
@@ -3964,7 +3892,7 @@
           <w:sz w:val="20"/>
           <w:szCs w:val="20"/>
         </w:rPr>
-        <w:t xml:space="preserve">Nothing self-approves. Generated tools sit in a sandbox directory that is never auto-run, and there's a hard-coded forbidden list — no sudo, no rm -rf, no raw sockets in a tool that shouldn't need the network. Same philosophy as the deny-list you saw fire earlier: the model proposes, fixed code decides.</w:t>
+        <w:t xml:space="preserve">Nothing approves itself. New tools sit in a folder that never auto-runs. Same idea as the deny-list you saw fire: the model suggests, fixed code decides.</w:t>
       </w:r>
     </w:p>
     <w:p>
@@ -4008,7 +3936,7 @@
           <w:sz w:val="20"/>
           <w:szCs w:val="20"/>
         </w:rPr>
-        <w:t xml:space="preserve">This table is the honest engineering of the project. Six gigabytes of VRAM, a laptop GPU, no cloud.</w:t>
+        <w:t xml:space="preserve">This table is the real engineering. Six gigs of VRAM, a laptop GPU, no cloud.</w:t>
       </w:r>
       <w:r>
         <w:br/>
@@ -4028,7 +3956,7 @@
           <w:sz w:val="20"/>
           <w:szCs w:val="20"/>
         </w:rPr>
-        <w:t xml:space="preserve">The main model stays pinned on the GPU permanently so it never pays a reload. Vision runs on the CPU on purpose — I tried it on the GPU and it evicted the main model, which turned every reply into a sixteen-second wait. Sub-agents are small enough to sit on the CPU in parallel.</w:t>
+        <w:t xml:space="preserve">The main model stays on the GPU so it never reloads. Vision runs on CPU on purpose — on the GPU it pushed the main model out and replies took sixteen seconds.</w:t>
       </w:r>
       <w:r>
         <w:br/>
@@ -4048,7 +3976,7 @@
           <w:sz w:val="20"/>
           <w:szCs w:val="20"/>
         </w:rPr>
-        <w:t xml:space="preserve">One line here is now out of date in my favour: it says speech-to-text runs on the CPU at about a second and a half. I moved it onto the GPU this week and it's seventy-seven milliseconds — twenty times faster. That's why the demo you just watched felt responsive.</w:t>
+        <w:t xml:space="preserve">One line is out of date in my favour. It says speech-to-text runs on CPU at 1.5 seconds. I moved it to the GPU — it's 77 milliseconds now. Twenty times faster.</w:t>
       </w:r>
     </w:p>
     <w:p>
@@ -4063,7 +3991,7 @@
           <w:sz w:val="16"/>
           <w:szCs w:val="16"/>
         </w:rPr>
-        <w:t xml:space="preserve">Note: Deliberately flagging your own stale doc, and the fix being a 20x win, reads as someone who measures things. Verified: aria-bench asr p50 1546ms -&gt; 77ms.</w:t>
+        <w:t xml:space="preserve">Note: Flagging your own stale doc, where the fix is a 20x win, reads as someone who measures things.</w:t>
       </w:r>
     </w:p>
     <w:p>
@@ -4107,27 +4035,7 @@
           <w:sz w:val="20"/>
           <w:szCs w:val="20"/>
         </w:rPr>
-        <w:t xml:space="preserve">I wrote this before building most of it. Runaway sub-agents, memory growing without bound, the proactive engine becoming annoying, and a vision system that watches your screen being an obvious privacy problem. Each one has a mitigation next to it — budgets, decay, a feedback loop that goes quiet after repeated rejections, and a privacy gate that stops screen capture on banking or password apps.</w:t>
-      </w:r>
-      <w:r>
-        <w:br/>
-      </w:r>
-      <w:r>
-        <w:rPr>
-          <w:sz w:val="20"/>
-          <w:szCs w:val="20"/>
-        </w:rPr>
-        <w:t xml:space="preserve"/>
-      </w:r>
-      <w:r>
-        <w:br/>
-      </w:r>
-      <w:r>
-        <w:rPr>
-          <w:sz w:val="20"/>
-          <w:szCs w:val="20"/>
-        </w:rPr>
-        <w:t xml:space="preserve">One row is the reason I cut a feature, and that's the next thing I want to tell you.</w:t>
+        <w:t xml:space="preserve">I wrote this before building most of it. Runaway agents, memory growing forever, and a system that watches your screen being an obvious privacy problem. Each has a fix next to it. One row is why I cut a feature — that's next.</w:t>
       </w:r>
     </w:p>
     <w:p>
@@ -4171,7 +4079,7 @@
           <w:sz w:val="20"/>
           <w:szCs w:val="20"/>
         </w:rPr>
-        <w:t xml:space="preserve">So — where this actually stands.</w:t>
+        <w:t xml:space="preserve">So, where it actually stands.</w:t>
       </w:r>
       <w:r>
         <w:br/>
@@ -4191,7 +4099,7 @@
           <w:sz w:val="20"/>
           <w:szCs w:val="20"/>
         </w:rPr>
-        <w:t xml:space="preserve">The code is real. It's about twenty-seven thousand lines of C++ across a hundred and twenty-seven files, with two hundred and twenty-two tests passing, and twenty-nine separate subsystems in the cognitive layer. Memory, goals, identity, the sub-agents, the forge, the critic — those all exist and I can run them from the command line right now.</w:t>
+        <w:t xml:space="preserve">The code is real. Twenty-seven thousand lines of C++, a hundred and twenty-seven files, two hundred and twenty-two tests passing, twenty-nine subsystems. I can run all of it from the command line today.</w:t>
       </w:r>
       <w:r>
         <w:br/>
@@ -4211,7 +4119,7 @@
           <w:sz w:val="20"/>
           <w:szCs w:val="20"/>
         </w:rPr>
-        <w:t xml:space="preserve">What isn't finished is the wiring. Today those subsystems run as separate processes, each with its own copy of the event bus, which means the orchestrator can't yet see what perception publishes. They work individually; they don't yet work as one organism. Joining them into a single daemon is exactly what I'm doing at the moment — which is why I've been in the architecture rather than adding features.</w:t>
+        <w:t xml:space="preserve">What's not done is the wiring. Each piece runs as its own process with its own copy of that message board, so the orchestrator can't see what perception posts. They work alone, not together yet. Joining them into one program is what I'm doing now.</w:t>
       </w:r>
       <w:r>
         <w:br/>
@@ -4231,7 +4139,7 @@
           <w:sz w:val="20"/>
           <w:szCs w:val="20"/>
         </w:rPr>
-        <w:t xml:space="preserve">And two things here I stopped on purpose. Federation — running a shard on my phone — has the protocol layer written but no network listener, and I'd rather leave it clearly unfinished than fake it. And this one, the nightly fine-tuning loop: it needs around twelve gigabytes of VRAM to train an adapter on an eight-billion-parameter model. I have six. It cannot work on this hardware, so I stopped building it rather than ship something that half-runs.</w:t>
+        <w:t xml:space="preserve">Two things I stopped on purpose. Federation has the protocol but no network layer. And the nightly fine-tuning needs twelve gigs of VRAM — I have six, so I stopped rather than ship something broken.</w:t>
       </w:r>
       <w:r>
         <w:br/>
@@ -4251,7 +4159,7 @@
           <w:sz w:val="20"/>
           <w:szCs w:val="20"/>
         </w:rPr>
-        <w:t xml:space="preserve">That's also why you saw a couple of rough edges in the live demo. I've been building this since March, on my own, and I'd rather show it to you running for real and tell you where the seams are than play you a recording that went perfectly.</w:t>
+        <w:t xml:space="preserve">That's also why you saw rough edges earlier. I've been building this since March, on my own. I'd rather show it running for real and tell you where the seams are.</w:t>
       </w:r>
     </w:p>
     <w:p>
@@ -4266,7 +4174,7 @@
           <w:sz w:val="16"/>
           <w:szCs w:val="16"/>
         </w:rPr>
-        <w:t xml:space="preserve">Note: Every number here is verified against the ARISE.3.0 branch: 26,990 lines / 127 files / 222 tests / 29 subsystems under arise/cortex/. Say 'since March' — the first commit is 2026-03-21, so 'over six months' is checkable and slightly off.</w:t>
+        <w:t xml:space="preserve">Note: Numbers verified on the ARISE.3.0 branch: 26,990 lines / 127 files / 222 tests / 29 subsystems under arise/cortex/. Say 'since March' — first commit is 2026-03-21.</w:t>
       </w:r>
     </w:p>
     <w:p>
@@ -4296,7 +4204,7 @@
           <w:sz w:val="18"/>
           <w:szCs w:val="18"/>
         </w:rPr>
-        <w:t xml:space="preserve">SCROLL TO:  the What a Day With ARISE Looks Like narrative at the bottom</w:t>
+        <w:t xml:space="preserve">SCROLL TO:  the day-in-the-life narrative at the bottom</w:t>
       </w:r>
     </w:p>
     <w:p>
@@ -4310,7 +4218,7 @@
           <w:sz w:val="20"/>
           <w:szCs w:val="20"/>
         </w:rPr>
-        <w:t xml:space="preserve">Last thing. This section at the bottom isn't a transcript — it's the target. It's what the system should feel like once those pieces are joined, and I wrote it early so I'd have something concrete to build towards.</w:t>
+        <w:t xml:space="preserve">Last thing. This isn't a transcript — it's the target, what it should feel like once those pieces are joined.</w:t>
       </w:r>
       <w:r>
         <w:br/>
@@ -4330,7 +4238,7 @@
           <w:sz w:val="20"/>
           <w:szCs w:val="20"/>
         </w:rPr>
-        <w:t xml:space="preserve">Some of it already happens. It remembers across sessions, it holds goals for days, it runs real commands safely. The part that doesn't happen yet is it speaking first, on its own, because that needs the perception side connected to the orchestrator. That's the next milestone.</w:t>
+        <w:t xml:space="preserve">Some already happens: it remembers across sessions, holds goals for days, runs real commands safely. What doesn't yet is speaking first, on its own. That's the next milestone.</w:t>
       </w:r>
     </w:p>
     <w:p>
@@ -4345,7 +4253,7 @@
           <w:sz w:val="16"/>
           <w:szCs w:val="16"/>
         </w:rPr>
-        <w:t xml:space="preserve">Note: Naming this section as aspirational is essential — presented as current behaviour it is the least defensible thing in the README. Framed as a design target it becomes a strength.</w:t>
+        <w:t xml:space="preserve">Note: Framing this as a target is essential. Presented as current behaviour it is the least defensible thing in the README.</w:t>
       </w:r>
     </w:p>
     <w:p>
@@ -4373,7 +4281,7 @@
           <w:sz w:val="20"/>
           <w:szCs w:val="20"/>
         </w:rPr>
-        <w:t xml:space="preserve">Everything below assumes Part B (the live demo) runs as written at 5m10s.</w:t>
+        <w:t xml:space="preserve">All assume Part B (the live demo) runs as written at 5m 10s.</w:t>
       </w:r>
     </w:p>
     <w:p>
@@ -4386,7 +4294,7 @@
           <w:sz w:val="20"/>
           <w:szCs w:val="20"/>
         </w:rPr>
-        <w:t xml:space="preserve">FULL — every block  →  about 16 minutes 30</w:t>
+        <w:t xml:space="preserve">FULL — every block  →  about 11 minutes 40</w:t>
       </w:r>
     </w:p>
     <w:p>
@@ -4398,7 +4306,7 @@
           <w:sz w:val="20"/>
           <w:szCs w:val="20"/>
         </w:rPr>
-        <w:t xml:space="preserve">Complete and defensible, but be realistic: most people screening applications will not watch sixteen minutes. Only choose this if you are also submitting a timestamped chapter list so a reviewer can jump to the architecture and the honest-status sections.</w:t>
+        <w:t xml:space="preserve">Complete and defensible. Add a timestamped chapter list so a reviewer can jump straight to the architecture and the honest-status sections.</w:t>
       </w:r>
     </w:p>
     <w:p>
@@ -4411,7 +4319,7 @@
           <w:sz w:val="20"/>
           <w:szCs w:val="20"/>
         </w:rPr>
-        <w:t xml:space="preserve">RECOMMENDED — D1, D4, D6, D12, D13  →  about 11 minutes 30</w:t>
+        <w:t xml:space="preserve">RECOMMENDED — D1, D4, D6, D12, D13  →  about 8 minutes 55</w:t>
       </w:r>
     </w:p>
     <w:p>
@@ -4424,7 +4332,7 @@
           <w:sz w:val="20"/>
           <w:szCs w:val="20"/>
         </w:rPr>
-        <w:t xml:space="preserve">Banner and framing, the ten phases handled honestly, the full architecture walk, the honest status, and the closing frame. Drops D2, D3, D5, D7, D8, D9, D10, D11. This keeps every argument and loses only elaboration.</w:t>
+        <w:t xml:space="preserve">Banner, the ten phases handled honestly, the full architecture walk, honest status, closing frame. Drops D2, D3, D5, D7, D8, D9, D10, D11. Keeps every argument, loses only elaboration.</w:t>
       </w:r>
     </w:p>
     <w:p>
@@ -4437,7 +4345,7 @@
           <w:sz w:val="20"/>
           <w:szCs w:val="20"/>
         </w:rPr>
-        <w:t xml:space="preserve">TIGHT — D4, D6, D12 only  →  about 9 minutes 30</w:t>
+        <w:t xml:space="preserve">TIGHT — D4, D6, D12 only  →  about 8 minutes 20</w:t>
       </w:r>
     </w:p>
     <w:p>
@@ -4449,7 +4357,7 @@
           <w:sz w:val="20"/>
           <w:szCs w:val="20"/>
         </w:rPr>
-        <w:t xml:space="preserve">The ten phases framed honestly, the architecture, and where it actually stands. Nothing else. If you also cut the Battery, Open-Firefox and Timer beats from Part B, this lands near 9 minutes flat.</w:t>
+        <w:t xml:space="preserve">The ten phases framed honestly, the architecture, and where it stands. If you also cut the Battery, Open-Firefox and Timer beats from Part B, this lands near 8 minutes flat.</w:t>
       </w:r>
     </w:p>
     <w:p>
@@ -4462,7 +4370,7 @@
           <w:sz w:val="20"/>
           <w:szCs w:val="20"/>
         </w:rPr>
-        <w:t xml:space="preserve">Whatever you choose, do not cut D4, D6 or D12. D6 is the technical substance, D12 is what makes a reviewer believe it, and D4 is what stops them discounting the ten-phase list before you reach either one.</w:t>
+        <w:t xml:space="preserve">Whatever you choose, do not cut D4, D6 or D12. D6 is the substance, D12 is what makes a reviewer believe it, and D4 stops them discounting the ten-phase list before you reach either.</w:t>
       </w:r>
     </w:p>
     <w:p>
@@ -4489,7 +4397,7 @@
           <w:sz w:val="20"/>
           <w:szCs w:val="20"/>
         </w:rPr>
-        <w:t xml:space="preserve">You are covering most of this in D4 and D12. If someone presses on a specific line:</w:t>
+        <w:t xml:space="preserve">D4 and D12 cover most of this. If someone presses on a specific line:</w:t>
       </w:r>
     </w:p>
     <w:p>
@@ -4502,7 +4410,7 @@
           <w:sz w:val="20"/>
           <w:szCs w:val="20"/>
         </w:rPr>
-        <w:t xml:space="preserve">•  “ARISE.3.0 ships ten interlocking systems” — “implements” is the defensible verb; “ships” implies all ten are running together, which is the one thing that isn't true yet.</w:t>
+        <w:t xml:space="preserve">•  “ships ten interlocking systems” — “implements” is defensible; “ships” implies all ten run together, which is the one thing that isn't true yet.</w:t>
       </w:r>
     </w:p>
     <w:p>
@@ -4515,7 +4423,7 @@
           <w:sz w:val="20"/>
           <w:szCs w:val="20"/>
         </w:rPr>
-        <w:t xml:space="preserve">•  Phase 9's specific figures (“28 min avg”, “0.86 vs 0.84”) read as measurements from a running loop. Your D12 line already says the loop can't run on 6 GB — make sure the README doesn't contradict you. Softening it to a planned design is the cleanest fix.</w:t>
+        <w:t xml:space="preserve">•  Phase 9's figures (“28 min avg”, “0.86 vs 0.84”) read as measurements from a running loop. Your D12 line says it can't run on 6 GB — make sure the README doesn't contradict you.</w:t>
       </w:r>
     </w:p>
     <w:p>
@@ -4528,7 +4436,7 @@
           <w:sz w:val="20"/>
           <w:szCs w:val="20"/>
         </w:rPr>
-        <w:t xml:space="preserve">•  Phase 7's “Lock your laptop → phone shard picks up the conversation” — protocol exists, listener does not. D12 covers this.</w:t>
+        <w:t xml:space="preserve">•  Phase 7's “lock your laptop → phone picks up” — protocol exists, listener does not.</w:t>
       </w:r>
     </w:p>
     <w:p>
@@ -4541,7 +4449,7 @@
           <w:sz w:val="20"/>
           <w:szCs w:val="20"/>
         </w:rPr>
-        <w:t xml:space="preserve">•  The hardware table lists Sesame CSM and openWakeWord; you actually run Piper with the wake word disabled.</w:t>
+        <w:t xml:space="preserve">•  The hardware table lists Sesame CSM and openWakeWord; you run Piper with the wake word off.</w:t>
       </w:r>
     </w:p>
     <w:p>
@@ -4555,7 +4463,7 @@
           <w:sz w:val="20"/>
           <w:szCs w:val="20"/>
         </w:rPr>
-        <w:t xml:space="preserve">•  The STATUS: OPERATIONAL badge is doing a lot of work. Consider STATUS: ACTIVE DEVELOPMENT — it costs you nothing and removes an easy target.</w:t>
+        <w:t xml:space="preserve">•  The STATUS: OPERATIONAL badge is an easy target. STATUS: ACTIVE DEVELOPMENT costs you nothing.</w:t>
       </w:r>
     </w:p>
     <w:p>

</xml_diff>